<commit_message>
feat: ajustes de laudos para mostrar os 5 e ajustes no template final
</commit_message>
<xml_diff>
--- a/template_final_real.docx
+++ b/template_final_real.docx
@@ -171,7 +171,19 @@
         <w:rPr>
           <w:bCs/>
         </w:rPr>
-        <w:t>, residentes e domiciliados (as) na </w:t>
+        <w:t xml:space="preserve">, </w:t>
+      </w:r>
+      <w:r>
+        <w:rPr>
+          <w:bCs/>
+        </w:rPr>
+        <w:t xml:space="preserve">com endereço </w:t>
+      </w:r>
+      <w:r>
+        <w:rPr>
+          <w:bCs/>
+        </w:rPr>
+        <w:t>na </w:t>
       </w:r>
       <w:r>
         <w:rPr>
@@ -792,6 +804,9 @@
         <w:t>(</w:t>
       </w:r>
       <w:r>
+        <w:t xml:space="preserve">NB: </w:t>
+      </w:r>
+      <w:r>
         <w:rPr>
           <w:shd w:val="clear" w:color="auto" w:fill="DBE5F1" w:themeFill="accent1" w:themeFillTint="33"/>
         </w:rPr>
@@ -801,31 +816,31 @@
         <w:rPr>
           <w:shd w:val="clear" w:color="auto" w:fill="DBE5F1" w:themeFill="accent1" w:themeFillTint="33"/>
         </w:rPr>
-        <w:t>) em</w:t>
+        <w:t xml:space="preserve">) </w:t>
       </w:r>
       <w:r>
         <w:rPr>
           <w:shd w:val="clear" w:color="auto" w:fill="DBE5F1" w:themeFill="accent1" w:themeFillTint="33"/>
         </w:rPr>
-        <w:t xml:space="preserve"> DER </w:t>
+        <w:t xml:space="preserve">e </w:t>
       </w:r>
       <w:r>
         <w:rPr>
           <w:shd w:val="clear" w:color="auto" w:fill="DBE5F1" w:themeFill="accent1" w:themeFillTint="33"/>
         </w:rPr>
-        <w:t>(</w:t>
+        <w:t xml:space="preserve">DER </w:t>
       </w:r>
       <w:r>
         <w:rPr>
           <w:shd w:val="clear" w:color="auto" w:fill="DBE5F1" w:themeFill="accent1" w:themeFillTint="33"/>
         </w:rPr>
+        <w:t xml:space="preserve">em </w:t>
+      </w:r>
+      <w:r>
+        <w:rPr>
+          <w:shd w:val="clear" w:color="auto" w:fill="DBE5F1" w:themeFill="accent1" w:themeFillTint="33"/>
+        </w:rPr>
         <w:t>[data de entrada do requerimento]</w:t>
-      </w:r>
-      <w:r>
-        <w:rPr>
-          <w:shd w:val="clear" w:color="auto" w:fill="DBE5F1" w:themeFill="accent1" w:themeFillTint="33"/>
-        </w:rPr>
-        <w:t>)</w:t>
       </w:r>
       <w:r>
         <w:t>,</w:t>
@@ -1131,6 +1146,95 @@
       </w:r>
     </w:p>
     <w:p>
+      <w:r>
+        <w:t>O</w:t>
+      </w:r>
+      <w:r>
+        <w:t xml:space="preserve"> laudo médico</w:t>
+      </w:r>
+      <w:r>
+        <w:t xml:space="preserve"> datado de </w:t>
+      </w:r>
+      <w:r>
+        <w:rPr>
+          <w:rStyle w:val="Forte"/>
+        </w:rPr>
+        <w:t>[data do laudo médico</w:t>
+      </w:r>
+      <w:r>
+        <w:rPr>
+          <w:rStyle w:val="Forte"/>
+        </w:rPr>
+        <w:t xml:space="preserve"> 1</w:t>
+      </w:r>
+      <w:r>
+        <w:rPr>
+          <w:rStyle w:val="Forte"/>
+        </w:rPr>
+        <w:t>]</w:t>
+      </w:r>
+      <w:r>
+        <w:t xml:space="preserve">, foi emitido pelo </w:t>
+      </w:r>
+      <w:r>
+        <w:rPr>
+          <w:rStyle w:val="Forte"/>
+        </w:rPr>
+        <w:t>[especialidade do médico</w:t>
+      </w:r>
+      <w:r>
+        <w:rPr>
+          <w:rStyle w:val="Forte"/>
+        </w:rPr>
+        <w:t xml:space="preserve"> 1</w:t>
+      </w:r>
+      <w:r>
+        <w:rPr>
+          <w:rStyle w:val="Forte"/>
+        </w:rPr>
+        <w:t>]</w:t>
+      </w:r>
+      <w:r>
+        <w:rPr>
+          <w:rStyle w:val="Forte"/>
+        </w:rPr>
+        <w:t xml:space="preserve"> </w:t>
+      </w:r>
+      <w:r>
+        <w:rPr>
+          <w:rStyle w:val="Forte"/>
+        </w:rPr>
+        <w:t>[nome do médico</w:t>
+      </w:r>
+      <w:r>
+        <w:rPr>
+          <w:rStyle w:val="Forte"/>
+        </w:rPr>
+        <w:t xml:space="preserve"> 1</w:t>
+      </w:r>
+      <w:r>
+        <w:rPr>
+          <w:rStyle w:val="Forte"/>
+        </w:rPr>
+        <w:t>]</w:t>
+      </w:r>
+      <w:r>
+        <w:t>, que</w:t>
+      </w:r>
+      <w:r>
+        <w:t xml:space="preserve"> [</w:t>
+      </w:r>
+      <w:r>
+        <w:t>descrição do laudo</w:t>
+      </w:r>
+      <w:r>
+        <w:t xml:space="preserve"> 1</w:t>
+      </w:r>
+      <w:r>
+        <w:t>]</w:t>
+      </w:r>
+    </w:p>
+    <w:p>
       <w:pPr>
         <w:rPr>
           <w:i/>
@@ -1150,7 +1254,7 @@
         <w:rPr>
           <w:rStyle w:val="Forte"/>
         </w:rPr>
-        <w:t>[data do laudo médico]</w:t>
+        <w:t>[data do laudo médico 2]</w:t>
       </w:r>
       <w:r>
         <w:t xml:space="preserve">, foi emitido pelo </w:t>
@@ -1159,28 +1263,145 @@
         <w:rPr>
           <w:rStyle w:val="Forte"/>
         </w:rPr>
-        <w:t>[especialidade do médico]</w:t>
+        <w:t>[especialidade do médico 2] [nome do médico 2]</w:t>
+      </w:r>
+      <w:r>
+        <w:t>, que [</w:t>
+      </w:r>
+      <w:r>
+        <w:t>descrição do laudo</w:t>
+      </w:r>
+      <w:r>
+        <w:t xml:space="preserve"> 2</w:t>
+      </w:r>
+      <w:r>
+        <w:t>]</w:t>
+      </w:r>
+      <w:r>
+        <w:t xml:space="preserve">             </w:t>
+      </w:r>
+    </w:p>
+    <w:p>
+      <w:r>
+        <w:t>O</w:t>
+      </w:r>
+      <w:r>
+        <w:t xml:space="preserve"> laudo médico</w:t>
+      </w:r>
+      <w:r>
+        <w:t xml:space="preserve"> datado de </w:t>
       </w:r>
       <w:r>
         <w:rPr>
           <w:rStyle w:val="Forte"/>
         </w:rPr>
-        <w:t xml:space="preserve"> </w:t>
+        <w:t>[data do laudo médico 3]</w:t>
+      </w:r>
+      <w:r>
+        <w:t xml:space="preserve">, foi emitido pelo </w:t>
       </w:r>
       <w:r>
         <w:rPr>
           <w:rStyle w:val="Forte"/>
         </w:rPr>
-        <w:t>[nome do médico]</w:t>
-      </w:r>
-      <w:r>
-        <w:t>, que</w:t>
-      </w:r>
-      <w:r>
-        <w:t xml:space="preserve"> [</w:t>
-      </w:r>
-      <w:r>
-        <w:t>descrição do laudo]</w:t>
+        <w:t>[especialidade do médico 3] [nome do médico 3]</w:t>
+      </w:r>
+      <w:r>
+        <w:t>, que [</w:t>
+      </w:r>
+      <w:r>
+        <w:t>descrição do laudo</w:t>
+      </w:r>
+      <w:r>
+        <w:t xml:space="preserve"> 3</w:t>
+      </w:r>
+      <w:r>
+        <w:t>]</w:t>
+      </w:r>
+    </w:p>
+    <w:p>
+      <w:pPr>
+        <w:rPr>
+          <w:i/>
+          <w:iCs/>
+        </w:rPr>
+      </w:pPr>
+      <w:r>
+        <w:t>O</w:t>
+      </w:r>
+      <w:r>
+        <w:t xml:space="preserve"> laudo médico</w:t>
+      </w:r>
+      <w:r>
+        <w:t xml:space="preserve"> datado de </w:t>
+      </w:r>
+      <w:r>
+        <w:rPr>
+          <w:rStyle w:val="Forte"/>
+        </w:rPr>
+        <w:t>[data do laudo médico 4]</w:t>
+      </w:r>
+      <w:r>
+        <w:t xml:space="preserve">, foi emitido pelo </w:t>
+      </w:r>
+      <w:r>
+        <w:rPr>
+          <w:rStyle w:val="Forte"/>
+        </w:rPr>
+        <w:t>[especialidade do médico 4] [nome do médico 4]</w:t>
+      </w:r>
+      <w:r>
+        <w:t>, que [</w:t>
+      </w:r>
+      <w:r>
+        <w:t>descrição do laudo</w:t>
+      </w:r>
+      <w:r>
+        <w:t xml:space="preserve"> 4</w:t>
+      </w:r>
+      <w:r>
+        <w:t>]</w:t>
+      </w:r>
+      <w:r>
+        <w:t xml:space="preserve">             </w:t>
+      </w:r>
+    </w:p>
+    <w:p>
+      <w:r>
+        <w:t>O</w:t>
+      </w:r>
+      <w:r>
+        <w:t xml:space="preserve"> laudo médico</w:t>
+      </w:r>
+      <w:r>
+        <w:t xml:space="preserve"> datado de </w:t>
+      </w:r>
+      <w:r>
+        <w:rPr>
+          <w:rStyle w:val="Forte"/>
+        </w:rPr>
+        <w:t>[data do laudo médico 5]</w:t>
+      </w:r>
+      <w:r>
+        <w:t xml:space="preserve">, foi emitido pelo </w:t>
+      </w:r>
+      <w:r>
+        <w:rPr>
+          <w:rStyle w:val="Forte"/>
+        </w:rPr>
+        <w:t>[especialidade do médico 5] [nome do médico 5]</w:t>
+      </w:r>
+      <w:r>
+        <w:t>, que [</w:t>
+      </w:r>
+      <w:r>
+        <w:t>descrição do laudo</w:t>
+      </w:r>
+      <w:r>
+        <w:t xml:space="preserve"> 5</w:t>
+      </w:r>
+      <w:r>
+        <w:t>]</w:t>
       </w:r>
       <w:r>
         <w:t xml:space="preserve">             </w:t>
@@ -1257,187 +1478,125 @@
     </w:p>
     <w:p>
       <w:pPr>
+        <w:shd w:val="clear" w:color="auto" w:fill="DBE5F1" w:themeFill="accent1" w:themeFillTint="33"/>
+      </w:pPr>
+      <w:r>
+        <w:t xml:space="preserve">Confirma-se o diagnóstico de </w:t>
+      </w:r>
+      <w:r>
         <w:rPr>
           <w:rStyle w:val="Forte"/>
-          <w:b w:val="0"/>
-          <w:bCs w:val="0"/>
-        </w:rPr>
-      </w:pPr>
-      <w:r>
-        <w:t xml:space="preserve">Em </w:t>
+        </w:rPr>
+        <w:t>[deficiência e a CID correspondente]</w:t>
+      </w:r>
+      <w:r>
+        <w:t xml:space="preserve"> associada ao </w:t>
       </w:r>
       <w:r>
         <w:rPr>
           <w:rStyle w:val="Forte"/>
         </w:rPr>
-        <w:t xml:space="preserve">laudo psiquiátrico datado de </w:t>
+        <w:t>[deficiência e a CID correspondente]</w:t>
+      </w:r>
+      <w:r>
+        <w:t xml:space="preserve">, com prescrição de </w:t>
       </w:r>
       <w:r>
         <w:rPr>
           <w:rStyle w:val="Forte"/>
         </w:rPr>
-        <w:t xml:space="preserve">[data do </w:t>
+        <w:t>[medicamento prescrito]</w:t>
+      </w:r>
+      <w:r>
+        <w:t xml:space="preserve">, medicamento controlado, indicado </w:t>
+      </w:r>
+      <w:r>
+        <w:t>[descrição para que serve o medicamento]</w:t>
       </w:r>
       <w:r>
         <w:rPr>
           <w:rStyle w:val="Forte"/>
         </w:rPr>
-        <w:t>“segundo laudo”]</w:t>
-      </w:r>
-      <w:r>
-        <w:t xml:space="preserve">, o </w:t>
+        <w:t xml:space="preserve"> </w:t>
+      </w:r>
+      <w:r>
+        <w:t>(anexo 08).</w:t>
+      </w:r>
+    </w:p>
+    <w:p>
+      <w:r>
+        <w:t xml:space="preserve">Diante das manifestações clínicas e dos impactos educacionais e sociais, constata-se que o requerente apresenta </w:t>
       </w:r>
       <w:r>
         <w:rPr>
           <w:rStyle w:val="Forte"/>
         </w:rPr>
-        <w:t xml:space="preserve">Dr. </w:t>
+        <w:t>impedimento de longo prazo de natureza mental e comportamental</w:t>
+      </w:r>
+      <w:r>
+        <w:t xml:space="preserve">, que </w:t>
       </w:r>
       <w:r>
         <w:rPr>
           <w:rStyle w:val="Forte"/>
         </w:rPr>
-        <w:t>[Nome do médico]</w:t>
-      </w:r>
-      <w:r>
-        <w:t xml:space="preserve"> descreve </w:t>
-      </w:r>
-      <w:r>
-        <w:t xml:space="preserve">o </w:t>
+        <w:t>compromete sua capacidade de comunicação, concentração, organização, aprendizagem, adaptação à rotina escolar</w:t>
+      </w:r>
+      <w:r>
+        <w:t xml:space="preserve">, </w:t>
+      </w:r>
+      <w:r>
+        <w:t>além de restringir sua participação plena e efetiva na sociedade</w:t>
+      </w:r>
+      <w:r>
+        <w:t xml:space="preserve">, exigindo </w:t>
       </w:r>
       <w:r>
         <w:rPr>
           <w:rStyle w:val="Forte"/>
         </w:rPr>
-        <w:t xml:space="preserve">histórico </w:t>
-      </w:r>
-      <w:r>
-        <w:rPr>
-          <w:rStyle w:val="Forte"/>
-        </w:rPr>
-        <w:t>[resumo do laudo médico]</w:t>
-      </w:r>
-    </w:p>
-    <w:p>
-      <w:pPr>
-        <w:shd w:val="clear" w:color="auto" w:fill="DBE5F1" w:themeFill="accent1" w:themeFillTint="33"/>
-      </w:pPr>
-      <w:r>
-        <w:t xml:space="preserve">Confirma-se o diagnóstico de </w:t>
-      </w:r>
-      <w:r>
-        <w:rPr>
-          <w:rStyle w:val="Forte"/>
-        </w:rPr>
-        <w:t>[deficiência e a CID correspondente]</w:t>
-      </w:r>
-      <w:r>
-        <w:t xml:space="preserve"> associada ao </w:t>
-      </w:r>
-      <w:r>
-        <w:rPr>
-          <w:rStyle w:val="Forte"/>
-        </w:rPr>
-        <w:t>[deficiência e a CID correspondente]</w:t>
-      </w:r>
-      <w:r>
-        <w:t xml:space="preserve">, com prescrição de </w:t>
-      </w:r>
-      <w:r>
-        <w:rPr>
-          <w:rStyle w:val="Forte"/>
-        </w:rPr>
-        <w:t>[medicamento prescrito]</w:t>
-      </w:r>
-      <w:r>
-        <w:t xml:space="preserve">, medicamento controlado, indicado </w:t>
-      </w:r>
-      <w:r>
-        <w:t>[descrição para que serve o medicamento]</w:t>
-      </w:r>
-      <w:r>
-        <w:rPr>
-          <w:rStyle w:val="Forte"/>
-        </w:rPr>
+        <w:t>acompanhamento permanente e suporte especializado</w:t>
+      </w:r>
+      <w:r>
         <w:t xml:space="preserve"> </w:t>
       </w:r>
       <w:r>
-        <w:t>(anexo 08).</w:t>
-      </w:r>
-    </w:p>
-    <w:p>
-      <w:r>
-        <w:t xml:space="preserve">Diante das manifestações clínicas e dos impactos educacionais e sociais, constata-se que o requerente apresenta </w:t>
-      </w:r>
-      <w:r>
-        <w:rPr>
-          <w:rStyle w:val="Forte"/>
-        </w:rPr>
-        <w:t>impedimento de longo prazo de natureza mental e comportamental</w:t>
-      </w:r>
-      <w:r>
-        <w:t xml:space="preserve">, que </w:t>
-      </w:r>
-      <w:r>
-        <w:rPr>
-          <w:rStyle w:val="Forte"/>
-        </w:rPr>
-        <w:t>compromete sua capacidade de comunicação, concentração, organização, aprendizagem, adaptação à rotina escolar</w:t>
-      </w:r>
-      <w:r>
-        <w:t xml:space="preserve">, </w:t>
-      </w:r>
-      <w:r>
-        <w:t>além de restringir sua participação plena e efetiva na sociedade</w:t>
-      </w:r>
-      <w:r>
-        <w:t xml:space="preserve">, exigindo </w:t>
-      </w:r>
-      <w:r>
-        <w:rPr>
-          <w:rStyle w:val="Forte"/>
-        </w:rPr>
-        <w:t>acompanhamento permanente e suporte especializado</w:t>
+        <w:t>e ainda impede sua genitora de trabalhar para ajudar na renda familiar.</w:t>
       </w:r>
       <w:r>
         <w:t xml:space="preserve"> </w:t>
       </w:r>
-      <w:r>
-        <w:t>e ainda impede sua genitora de trabalhar para ajudar na renda familiar.</w:t>
+    </w:p>
+    <w:p>
+      <w:r>
+        <w:lastRenderedPageBreak/>
+        <w:t>Importa frisar ainda que a sua inserção no mercado de trabalho quando da maioridade será bastante difícil, pois estará em disparidade de condições na busca pelo labor com as demais pessoas, apresentando importante déficit neurológico.</w:t>
+      </w:r>
+    </w:p>
+    <w:p>
+      <w:r>
+        <w:t xml:space="preserve">Isto posto, </w:t>
+      </w:r>
+      <w:r>
+        <w:t>a parte</w:t>
+      </w:r>
+      <w:r>
+        <w:t xml:space="preserve"> requerente socorre-se a esta justiça para a satisfação de seu direito, já que faz </w:t>
+      </w:r>
+      <w:r>
+        <w:rPr>
+          <w:i/>
+        </w:rPr>
+        <w:t>jus</w:t>
+      </w:r>
+      <w:r>
+        <w:t xml:space="preserve"> ao benefício pleiteado.</w:t>
       </w:r>
       <w:r>
         <w:t xml:space="preserve"> </w:t>
       </w:r>
     </w:p>
     <w:p>
-      <w:r>
-        <w:t>Importa frisar ainda que a sua inserção no mercado de trabalho quando da maioridade será bastante difícil, pois estará em disparidade de condições na busca pelo labor com as demais pessoas, apresentando importante déficit neurológico.</w:t>
-      </w:r>
-    </w:p>
-    <w:p>
-      <w:r>
-        <w:t xml:space="preserve">Isto posto, </w:t>
-      </w:r>
-      <w:r>
-        <w:t>a parte</w:t>
-      </w:r>
-      <w:r>
-        <w:t xml:space="preserve"> requerente socorre-se a esta justiça para a satisfação de seu direito, já que faz </w:t>
-      </w:r>
-      <w:r>
-        <w:rPr>
-          <w:i/>
-        </w:rPr>
-        <w:t>jus</w:t>
-      </w:r>
-      <w:r>
-        <w:t xml:space="preserve"> ao benefício pleiteado.</w:t>
-      </w:r>
-      <w:r>
-        <w:t xml:space="preserve"> </w:t>
-      </w:r>
-    </w:p>
-    <w:p>
       <w:pPr>
         <w:pStyle w:val="Ttulo3"/>
         <w:rPr>
@@ -1448,7 +1607,6 @@
         <w:rPr>
           <w:rFonts w:eastAsia="Times New Roman"/>
         </w:rPr>
-        <w:lastRenderedPageBreak/>
         <w:t>Da miserabilidade</w:t>
       </w:r>
       <w:r>
@@ -1541,7 +1699,13 @@
         <w:t>(colocar valor),</w:t>
       </w:r>
       <w:r>
-        <w:t xml:space="preserve"> a título de aposentadoria(documento anexo), resultado em sérias dificuldades financeiras para manter um grupo familiar de 04 (quatro) pessoas.</w:t>
+        <w:t xml:space="preserve"> a título de aposentadoria</w:t>
+      </w:r>
+      <w:r>
+        <w:t xml:space="preserve"> </w:t>
+      </w:r>
+      <w:r>
+        <w:t>(documento anexo), resultado em sérias dificuldades financeiras para manter um grupo familiar de 04 (quatro) pessoas.</w:t>
       </w:r>
     </w:p>
     <w:p>
@@ -1624,6 +1788,7 @@
     </w:p>
     <w:p>
       <w:r>
+        <w:lastRenderedPageBreak/>
         <w:t>Portanto, imperioso seja concedido o benefício de prestação continuada à parte Autora, devido sua condição de pessoa deficiente, carecedora do devido amparo estatal.</w:t>
       </w:r>
     </w:p>
@@ -1661,7 +1826,6 @@
     </w:p>
     <w:p>
       <w:r>
-        <w:lastRenderedPageBreak/>
         <w:t>Exposto a condição d</w:t>
       </w:r>
       <w:r>
@@ -1837,6 +2001,7 @@
         <w:rPr>
           <w:rFonts w:cstheme="minorHAnsi"/>
         </w:rPr>
+        <w:lastRenderedPageBreak/>
         <w:t>Conforme nos ensina a jurista, mestre e Prof. Juliana de Oliveira Xavier Ribeiro (Direito Previdenciário Esquematizado, 2ª. Ed, 2011, Quartier Latin, p. 494/495):</w:t>
       </w:r>
     </w:p>
@@ -1861,11 +2026,7 @@
         <w:t xml:space="preserve">. </w:t>
       </w:r>
       <w:r>
-        <w:t xml:space="preserve">Sendo assim, para efeitos de concessão e </w:t>
-      </w:r>
-      <w:r>
-        <w:lastRenderedPageBreak/>
-        <w:t>avaliação do benefício de prestação continuada, a pessoa portadora de deficiência beneficiária é aquela cujo nível de incapacidade a impede para a vida independente e para o trabalho”.</w:t>
+        <w:t>Sendo assim, para efeitos de concessão e avaliação do benefício de prestação continuada, a pessoa portadora de deficiência beneficiária é aquela cujo nível de incapacidade a impede para a vida independente e para o trabalho”.</w:t>
       </w:r>
       <w:r>
         <w:t xml:space="preserve"> </w:t>
@@ -2145,7 +2306,14 @@
         <w:rPr>
           <w:rFonts w:cstheme="minorHAnsi"/>
         </w:rPr>
-        <w:t>Assim, a deficiência que dá acesso ao BPC-LOAS não é mais compreendida como aquela que incapacita a pessoa para a vida independente e para o trabalho, mas sim como um impedimento que, em interação com uma ou mais barreiras, possa restringir sua participação plena e efetiva na sociedade, em igualdade de condições com as demais pessoas.</w:t>
+        <w:t xml:space="preserve">Assim, a deficiência que dá acesso ao BPC-LOAS não é mais compreendida como aquela que incapacita a pessoa para a vida independente e para o trabalho, mas sim como um impedimento que, em interação com uma ou mais barreiras, </w:t>
+      </w:r>
+      <w:r>
+        <w:rPr>
+          <w:rFonts w:cstheme="minorHAnsi"/>
+        </w:rPr>
+        <w:lastRenderedPageBreak/>
+        <w:t>possa restringir sua participação plena e efetiva na sociedade, em igualdade de condições com as demais pessoas.</w:t>
       </w:r>
     </w:p>
     <w:p>
@@ -2271,7 +2439,6 @@
         <w:ind w:left="1418" w:firstLine="0"/>
       </w:pPr>
       <w:r>
-        <w:lastRenderedPageBreak/>
         <w:t xml:space="preserve">V - </w:t>
       </w:r>
       <w:r>
@@ -2386,6 +2553,7 @@
         <w:ind w:left="1418" w:firstLine="0"/>
       </w:pPr>
       <w:r>
+        <w:lastRenderedPageBreak/>
         <w:t xml:space="preserve">f) </w:t>
       </w:r>
       <w:r>
@@ -2480,39 +2648,46 @@
         <w:pStyle w:val="Citao"/>
       </w:pPr>
       <w:r>
+        <w:t xml:space="preserve">PREVIDENCIÁRIO E PROCESSUAL CIVIL. BENEFÍCIO DE AMPARO SOCIAL À CRIANÇA PORTADORA DE DEFICIÊNCIA EM SITUAÇÃO DE RISCO SOCIAL. ART. 203, V, CF/88. LEI 8.742/93. REQUISITOS CUMPRIDOS. BENEFÍCIO DEVIDO. 1. </w:t>
+      </w:r>
+      <w:r>
+        <w:t>(...)</w:t>
+      </w:r>
+      <w:r>
+        <w:t xml:space="preserve"> 2. No caso concreto: Laudo pericial: No caso concreto, o perito afirma que a parte autora apresenta transtorno de déficit de atenção e hiperatividade. </w:t>
+      </w:r>
+      <w:r>
+        <w:rPr>
+          <w:b/>
+          <w:bCs/>
+        </w:rPr>
+        <w:t>De acordo com os transtornos hipercinéticos, podem se acompanhar de outras anomalias, as crianças hipercinéticas são frequentemente, imprudentes e impulsivos, sujeitas a acidentes, e incorrem em problemas disciplinares mais por infrações não premeditadas de regras que por desafio deliberado, tornando-se incapaz de exercer atividades laborativas.</w:t>
+      </w:r>
+      <w:r>
+        <w:t xml:space="preserve"> Laudo socioeconômico: realizado em 25/07/2018, informa que o grupo familiar da parte autora é composto por cinco pessoas. Renda proveniente da atividade de lavrador, exercida pelo padrasto da parte autora, no valor de R$ 250,00 mensais e do bolsa família. 3. </w:t>
+      </w:r>
+      <w:r>
+        <w:rPr>
+          <w:b/>
+          <w:bCs/>
+        </w:rPr>
+        <w:t xml:space="preserve">Observa-se que em razão da gravidade das limitações apresentadas, bem como, dos cuidados demandados pela parte autora, fica demonstrado que as despesas que a família precisa custear para promover seu desenvolvimento são elevadas, dispendiosas e contínuas, de modo que, evidentemente, a renda familiar auferida não é suficiente para o pagamento dessas despesas, sem que comprometa o acesso a bens essenciais à sobrevivência digna da </w:t>
+      </w:r>
+      <w:r>
+        <w:rPr>
+          <w:b/>
+          <w:bCs/>
+        </w:rPr>
         <w:lastRenderedPageBreak/>
-        <w:t xml:space="preserve">PREVIDENCIÁRIO E PROCESSUAL CIVIL. BENEFÍCIO DE AMPARO SOCIAL À CRIANÇA PORTADORA DE DEFICIÊNCIA EM SITUAÇÃO DE RISCO SOCIAL. ART. 203, V, CF/88. LEI 8.742/93. REQUISITOS CUMPRIDOS. BENEFÍCIO DEVIDO. 1. </w:t>
+        <w:t>requerente e seus familiares.</w:t>
+      </w:r>
+      <w:r>
+        <w:t xml:space="preserve"> 4. </w:t>
       </w:r>
       <w:r>
         <w:t>(...)</w:t>
       </w:r>
       <w:r>
-        <w:t xml:space="preserve"> 2. No caso concreto: Laudo pericial: No caso concreto, o perito afirma que a parte autora apresenta transtorno de déficit de atenção e hiperatividade. </w:t>
-      </w:r>
-      <w:r>
-        <w:rPr>
-          <w:b/>
-          <w:bCs/>
-        </w:rPr>
-        <w:t>De acordo com os transtornos hipercinéticos, podem se acompanhar de outras anomalias, as crianças hipercinéticas são frequentemente, imprudentes e impulsivos, sujeitas a acidentes, e incorrem em problemas disciplinares mais por infrações não premeditadas de regras que por desafio deliberado, tornando-se incapaz de exercer atividades laborativas.</w:t>
-      </w:r>
-      <w:r>
-        <w:t xml:space="preserve"> Laudo socioeconômico: realizado em 25/07/2018, informa que o grupo familiar da parte autora é composto por cinco pessoas. Renda proveniente da atividade de lavrador, exercida pelo padrasto da parte autora, no valor de R$ 250,00 mensais e do bolsa família. 3. </w:t>
-      </w:r>
-      <w:r>
-        <w:rPr>
-          <w:b/>
-          <w:bCs/>
-        </w:rPr>
-        <w:t>Observa-se que em razão da gravidade das limitações apresentadas, bem como, dos cuidados demandados pela parte autora, fica demonstrado que as despesas que a família precisa custear para promover seu desenvolvimento são elevadas, dispendiosas e contínuas, de modo que, evidentemente, a renda familiar auferida não é suficiente para o pagamento dessas despesas, sem que comprometa o acesso a bens essenciais à sobrevivência digna da requerente e seus familiares.</w:t>
-      </w:r>
-      <w:r>
-        <w:t xml:space="preserve"> 4. </w:t>
-      </w:r>
-      <w:r>
-        <w:t>(...)</w:t>
-      </w:r>
-      <w:r>
         <w:t xml:space="preserve"> (TRF-1 - AC: 00019217920174013315, Relator: DESEMBARGADOR FEDERAL RAFAEL PAULO, Data de Julgamento: 10/11/2021, 2ª Turma, Data de Publicação: PJe 19/11/2021 PAG)</w:t>
       </w:r>
     </w:p>
@@ -2547,7 +2722,6 @@
     </w:p>
     <w:p>
       <w:r>
-        <w:lastRenderedPageBreak/>
         <w:t>A legislação atual não exclui do acesso ao benefício aquelas pessoas que, embora deficientes, logram êxito em trabalhar ou suportar as adversidades impostas em seu dia a dia, sendo que se deve levar em consideração a interação com uma ou mais barreiras, que pode obstruir sua participação plena e efetiva na sociedade, em igualdade de condições com as demais pessoas (§ 1º do art. 20 da Lei nº 8.742/1993)</w:t>
       </w:r>
       <w:r>
@@ -2694,6 +2868,7 @@
         <w:rPr>
           <w:rFonts w:cstheme="minorHAnsi"/>
         </w:rPr>
+        <w:lastRenderedPageBreak/>
         <w:t>As condições socioeconômicas e culturais d</w:t>
       </w:r>
       <w:r>
@@ -2808,89 +2983,104 @@
         <w:rPr>
           <w:rFonts w:eastAsia="Times New Roman"/>
         </w:rPr>
+        <w:t>Da vulnerabilidade</w:t>
+      </w:r>
+    </w:p>
+    <w:p>
+      <w:r>
+        <w:t>Inicialmente, cumpre destacar o disposto no a</w:t>
+      </w:r>
+      <w:r>
+        <w:t>rt. 20, §3º</w:t>
+      </w:r>
+      <w:r>
+        <w:t xml:space="preserve"> da</w:t>
+      </w:r>
+      <w:r>
+        <w:t xml:space="preserve"> Lei nº 8.742/93 (LOAS</w:t>
+      </w:r>
+      <w:r>
+        <w:t xml:space="preserve">), que estabelece o critério objetivo de renda como parâmetro para a caracterização da miserabilidade. Ressalta-se, esse critério pode ser relativizado, admitindo a concessão do benefício mesmo quando a renda ultrapassar o limite legal, observa-se: </w:t>
+      </w:r>
+    </w:p>
+    <w:p>
+      <w:pPr>
+        <w:pStyle w:val="Citao"/>
+      </w:pPr>
+      <w:r>
+        <w:t>Considera-se incapaz de prover a manutenção da pessoa com deficiência ou idosa a família cuja renda mensal per capita seja inferior a 1/4 (um quarto) do salário-mínimo.</w:t>
+      </w:r>
+    </w:p>
+    <w:p>
+      <w:r>
+        <w:t xml:space="preserve">Encontra-se satisfeito o requisito econômico. </w:t>
+      </w:r>
+      <w:r>
+        <w:t xml:space="preserve">Tomando como base os documentos do processo </w:t>
+      </w:r>
+      <w:r>
+        <w:t xml:space="preserve"> administrativo e do CADUNICO, observa-se que a parte autora </w:t>
+      </w:r>
+      <w:r>
+        <w:t>preenche o requisito da miserabilidade</w:t>
+      </w:r>
+      <w:r>
+        <w:t xml:space="preserve">. </w:t>
+      </w:r>
+    </w:p>
+    <w:p>
+      <w:r>
+        <w:t xml:space="preserve">Ademais, cumpre salientar que a condição de vulnerabilidade da família em nada colabora para a saúde </w:t>
+      </w:r>
+      <w:r>
+        <w:t>do (a) peticionante</w:t>
+      </w:r>
+      <w:r>
+        <w:t xml:space="preserve">, que possui doença grave e não ostenta meios de subsidiar o tratamento adequado, </w:t>
+      </w:r>
+      <w:r>
+        <w:rPr>
+          <w:rStyle w:val="Forte"/>
+        </w:rPr>
+        <w:t>o que é imperativo</w:t>
+      </w:r>
+      <w:r>
+        <w:t>, em face da já reiterada dificuldade de futura</w:t>
+      </w:r>
+      <w:r>
+        <w:t xml:space="preserve"> </w:t>
+      </w:r>
+      <w:r>
+        <w:t>inserção no mercado de trabalho.</w:t>
+      </w:r>
+    </w:p>
+    <w:p>
+      <w:r>
+        <w:t xml:space="preserve">A Jurisprudência vem se posicionando nesse sentido: </w:t>
+      </w:r>
+    </w:p>
+    <w:p>
+      <w:pPr>
+        <w:pStyle w:val="Citao"/>
+      </w:pPr>
+      <w:r>
+        <w:t xml:space="preserve">BENEFÍCIO ASSISTENCIAL. QUESTÃO DE FATO. O grupo familiar é composto por 5 pessoas e o total da renda atinge o montante de r$ 1.312,00 - absolutamente de acordo com o § 3º do artigo 20 da lei n. </w:t>
+      </w:r>
+      <w:r>
         <w:lastRenderedPageBreak/>
-        <w:t>Da vulnerabilidade</w:t>
-      </w:r>
-    </w:p>
-    <w:p>
-      <w:r>
-        <w:t>Inicialmente, cumpre destacar o disposto no a</w:t>
-      </w:r>
-      <w:r>
-        <w:t>rt. 20, §3º</w:t>
-      </w:r>
-      <w:r>
-        <w:t xml:space="preserve"> da</w:t>
-      </w:r>
-      <w:r>
-        <w:t xml:space="preserve"> Lei nº 8.742/93 (LOAS</w:t>
-      </w:r>
-      <w:r>
-        <w:t xml:space="preserve">), que estabelece o critério objetivo de renda como parâmetro para a caracterização da miserabilidade. Ressalta-se, esse critério pode ser relativizado, admitindo a concessão do benefício mesmo quando a renda ultrapassar o limite legal, observa-se: </w:t>
-      </w:r>
-    </w:p>
-    <w:p>
-      <w:pPr>
-        <w:pStyle w:val="Citao"/>
-      </w:pPr>
-      <w:r>
-        <w:t>Considera-se incapaz de prover a manutenção da pessoa com deficiência ou idosa a família cuja renda mensal per capita seja inferior a 1/4 (um quarto) do salário-mínimo.</w:t>
-      </w:r>
-    </w:p>
-    <w:p>
-      <w:r>
-        <w:t xml:space="preserve">Encontra-se satisfeito o requisito econômico. </w:t>
-      </w:r>
-      <w:r>
-        <w:t xml:space="preserve">Tomando como base os documentos do processo </w:t>
-      </w:r>
-      <w:r>
-        <w:t xml:space="preserve"> administrativo e do CADUNICO, observa-se que a parte autora </w:t>
-      </w:r>
-      <w:r>
-        <w:t>preenche o requisito da miserabilidade</w:t>
-      </w:r>
-      <w:r>
-        <w:t xml:space="preserve">. </w:t>
-      </w:r>
-    </w:p>
-    <w:p>
-      <w:r>
-        <w:t xml:space="preserve">Ademais, cumpre salientar que a condição de vulnerabilidade da família em nada colabora para a saúde </w:t>
-      </w:r>
-      <w:r>
-        <w:t>do (a) peticionante</w:t>
-      </w:r>
-      <w:r>
-        <w:t xml:space="preserve">, que possui doença grave e não ostenta meios de subsidiar o tratamento adequado, </w:t>
-      </w:r>
-      <w:r>
-        <w:rPr>
-          <w:rStyle w:val="Forte"/>
-        </w:rPr>
-        <w:t>o que é imperativo</w:t>
-      </w:r>
-      <w:r>
-        <w:t>, em face da já reiterada dificuldade de futura</w:t>
+        <w:t xml:space="preserve">8.742/1993. Além disso, está comprovado o requisito do § 2º daquele dispositivo, pois o autor tem quadro neuropsiquiátrico de transtorno hipercinético (TDAH - </w:t>
+      </w:r>
+      <w:r>
+        <w:t>CID</w:t>
       </w:r>
       <w:r>
         <w:t xml:space="preserve"> </w:t>
       </w:r>
       <w:r>
-        <w:t>inserção no mercado de trabalho.</w:t>
-      </w:r>
-    </w:p>
-    <w:p>
-      <w:r>
-        <w:t xml:space="preserve">A Jurisprudência vem se posicionando nesse sentido: </w:t>
-      </w:r>
-    </w:p>
-    <w:p>
-      <w:pPr>
-        <w:pStyle w:val="Citao"/>
-      </w:pPr>
-      <w:r>
-        <w:t xml:space="preserve">BENEFÍCIO ASSISTENCIAL. QUESTÃO DE FATO. O grupo familiar é composto por 5 pessoas e o total da renda atinge o montante de r$ 1.312,00 - absolutamente de acordo com o § 3º do artigo 20 da lei n. 8.742/1993. Além disso, está comprovado o requisito do § 2º daquele dispositivo, pois o autor tem quadro neuropsiquiátrico de transtorno hipercinético (TDAH - </w:t>
+        <w:t>F</w:t>
+      </w:r>
+      <w:r>
+        <w:t>90.8) e transtorno de oposição (</w:t>
       </w:r>
       <w:r>
         <w:t>CID</w:t>
@@ -2902,39 +3092,23 @@
         <w:t>F</w:t>
       </w:r>
       <w:r>
-        <w:t>90.8) e transtorno de oposição (</w:t>
-      </w:r>
-      <w:r>
-        <w:t>CID</w:t>
+        <w:t xml:space="preserve">91.3). </w:t>
+      </w:r>
+      <w:r>
+        <w:rPr>
+          <w:b/>
+          <w:bCs/>
+        </w:rPr>
+        <w:t>Por fim, o direito ao benefício de prestação continuada não pressupõe a verificação de um estado de miserabilidade extremo - bastando estar demonstrada a insuficiência de meios para o beneficiário, dignamente, prover a própria manutenção ou de tê-la provida por sua família, tenho por configurada a situação de risco social necessária à concessão do benefício.</w:t>
       </w:r>
       <w:r>
         <w:t xml:space="preserve"> </w:t>
       </w:r>
       <w:r>
-        <w:t>F</w:t>
-      </w:r>
-      <w:r>
-        <w:t xml:space="preserve">91.3). </w:t>
-      </w:r>
-      <w:r>
-        <w:rPr>
-          <w:b/>
-          <w:bCs/>
-        </w:rPr>
-        <w:t>Por fim, o direito ao benefício de prestação continuada não pressupõe a verificação de um estado de miserabilidade extremo - bastando estar demonstrada a insuficiência de meios para o beneficiário, dignamente, prover a própria manutenção ou de tê-la provida por sua família, tenho por configurada a situação de risco social necessária à concessão do benefício.</w:t>
-      </w:r>
-      <w:r>
-        <w:t xml:space="preserve"> </w:t>
-      </w:r>
-      <w:r>
         <w:t>(...)</w:t>
       </w:r>
       <w:r>
-        <w:t xml:space="preserve"> (TRF-4 - AC: </w:t>
-      </w:r>
-      <w:r>
-        <w:lastRenderedPageBreak/>
-        <w:t>50005160520204047139 RS 5000516-05.2020.4.04.7139, Relator: JULIO GUILHERME BEREZOSKI SCHATTSCHNEIDER, Data de Julgamento: 10/11/2021, SEXTA TURMA)</w:t>
+        <w:t xml:space="preserve"> (TRF-4 - AC: 50005160520204047139 RS 5000516-05.2020.4.04.7139, Relator: JULIO GUILHERME BEREZOSKI SCHATTSCHNEIDER, Data de Julgamento: 10/11/2021, SEXTA TURMA)</w:t>
       </w:r>
       <w:r>
         <w:t xml:space="preserve"> (</w:t>
@@ -3123,7 +3297,11 @@
         <w:t xml:space="preserve"> </w:t>
       </w:r>
       <w:r>
-        <w:t>não atende aos requisitos de concessão do benefício, o pedido deverá ser indeferido pelo INSS, sendo desnecessária a avaliação da deficiência.  </w:t>
+        <w:t xml:space="preserve">não atende aos requisitos de concessão do benefício, o pedido </w:t>
+      </w:r>
+      <w:r>
+        <w:lastRenderedPageBreak/>
+        <w:t>deverá ser indeferido pelo INSS, sendo desnecessária a avaliação da deficiência.  </w:t>
       </w:r>
     </w:p>
     <w:p>
@@ -3177,7 +3355,6 @@
         <w:pStyle w:val="Citao"/>
       </w:pPr>
       <w:r>
-        <w:lastRenderedPageBreak/>
         <w:t>(i) Para os requerimentos administrativos formulados a partir de 07 de novembro de 2016 (Decreto n. 8.805/16), em que o indeferimento do Benefício da Prestação Continuada pelo INSS ocorrer em virtude do não reconhecimento da deficiência, </w:t>
       </w:r>
       <w:r>
@@ -3307,6 +3484,7 @@
         <w:rPr>
           <w:rStyle w:val="Ttulo1Char"/>
         </w:rPr>
+        <w:lastRenderedPageBreak/>
         <w:t>DA TUTELA DE URGÊNCIA</w:t>
       </w:r>
     </w:p>
@@ -3345,7 +3523,6 @@
     </w:p>
     <w:p>
       <w:r>
-        <w:lastRenderedPageBreak/>
         <w:t xml:space="preserve">Nesse sentido, o CPC exige dois requisitos para a concessão da tutela de urgência: </w:t>
       </w:r>
       <w:r>
@@ -3430,6 +3607,7 @@
         <w:rPr>
           <w:rStyle w:val="Ttulo1Char"/>
         </w:rPr>
+        <w:lastRenderedPageBreak/>
         <w:t>DOS REQUERIMENTOS PRELIMINARES</w:t>
       </w:r>
     </w:p>
@@ -3509,7 +3687,6 @@
     </w:p>
     <w:p>
       <w:r>
-        <w:lastRenderedPageBreak/>
         <w:t>Desta forma, requer-se o benefício da prioridade na tramitação do presente processo, eis que preenche os requisitos constantes no art. 1.048, inciso II do CPC, no art. 152, § 1º da Lei 8.069/90 (Estatuto da Criança e do Adolescente) e no art. 9º, inciso VII da Lei 13.146/2015 (Estatuto da Pessoa com Deficiência).</w:t>
       </w:r>
     </w:p>
@@ -3744,7 +3921,15 @@
           <w:rFonts w:eastAsia="Arial Nova Light"/>
           <w:szCs w:val="20"/>
         </w:rPr>
-        <w:t>, nos termos do art. 1.048, inciso II do CPC, no art. 152, § 1º da Lei 8.069/90 (Estatuto da Criança e do Adolescente) e no art. 9º, inciso VII da Lei 13.146/2015 (Estatuto da Pessoa com Deficiência)</w:t>
+        <w:t xml:space="preserve">, nos termos do art. 1.048, inciso II do CPC, no </w:t>
+      </w:r>
+      <w:r>
+        <w:rPr>
+          <w:rFonts w:eastAsia="Arial Nova Light"/>
+          <w:szCs w:val="20"/>
+        </w:rPr>
+        <w:lastRenderedPageBreak/>
+        <w:t>art. 152, § 1º da Lei 8.069/90 (Estatuto da Criança e do Adolescente) e no art. 9º, inciso VII da Lei 13.146/2015 (Estatuto da Pessoa com Deficiência)</w:t>
       </w:r>
       <w:r>
         <w:rPr>
@@ -3973,7 +4158,6 @@
         </w:rPr>
       </w:pPr>
       <w:r>
-        <w:lastRenderedPageBreak/>
         <w:t>designar data para realização da perícia médica, nomeando perito especialista</w:t>
       </w:r>
       <w:r>
@@ -4024,7 +4208,25 @@
           <w:bCs/>
           <w:szCs w:val="20"/>
         </w:rPr>
-        <w:t>[número do benefício]</w:t>
+        <w:t>[</w:t>
+      </w:r>
+      <w:r>
+        <w:rPr>
+          <w:rFonts w:eastAsia="Arial Nova Light"/>
+          <w:b/>
+          <w:bCs/>
+          <w:szCs w:val="20"/>
+        </w:rPr>
+        <w:t>Número do benefício</w:t>
+      </w:r>
+      <w:r>
+        <w:rPr>
+          <w:rFonts w:eastAsia="Arial Nova Light"/>
+          <w:b/>
+          <w:bCs/>
+          <w:szCs w:val="20"/>
+        </w:rPr>
+        <w:t>]</w:t>
       </w:r>
       <w:r>
         <w:rPr>
@@ -4139,7 +4341,25 @@
           <w:bCs/>
           <w:szCs w:val="20"/>
         </w:rPr>
-        <w:t>[número do benefício]</w:t>
+        <w:t>[</w:t>
+      </w:r>
+      <w:r>
+        <w:rPr>
+          <w:rFonts w:eastAsia="Arial Nova Light"/>
+          <w:b/>
+          <w:bCs/>
+          <w:szCs w:val="20"/>
+        </w:rPr>
+        <w:t>Número do benefício</w:t>
+      </w:r>
+      <w:r>
+        <w:rPr>
+          <w:rFonts w:eastAsia="Arial Nova Light"/>
+          <w:b/>
+          <w:bCs/>
+          <w:szCs w:val="20"/>
+        </w:rPr>
+        <w:t>]</w:t>
       </w:r>
       <w:r>
         <w:rPr>
@@ -4256,6 +4476,7 @@
           <w:rFonts w:eastAsia="Times New Roman"/>
           <w:szCs w:val="20"/>
         </w:rPr>
+        <w:lastRenderedPageBreak/>
         <w:t>em caso de recurso, condenação da autarquia ré, ao pagamento de custas e honorários advocatícios, eis que cabíveis em segundo grau de jurisdição, com fulcro no art. 55 da Lei 9.099/95 c/c art. 1º da Lei 10.259/01;</w:t>
       </w:r>
     </w:p>
@@ -4313,7 +4534,6 @@
         <w:snapToGrid w:val="0"/>
       </w:pPr>
       <w:r>
-        <w:lastRenderedPageBreak/>
         <w:t xml:space="preserve">A parte renuncia ao valor excedente a 60 (sessenta) salários-mínimos para fins de alçada. </w:t>
       </w:r>
     </w:p>
@@ -8563,28 +8783,28 @@
 </file>
 
 <file path=customXml/item1.xml><?xml version="1.0" encoding="utf-8"?>
-<b:Sources xmlns:b="http://schemas.openxmlformats.org/officeDocument/2006/bibliography" xmlns="http://schemas.openxmlformats.org/officeDocument/2006/bibliography" SelectedStyle="\APASixthEditionOfficeOnline.xsl" StyleName="APA" Version="6"/>
-</file>
-
-<file path=customXml/item2.xml><?xml version="1.0" encoding="utf-8"?>
 <go:gDocsCustomXmlDataStorage xmlns:go="http://customooxmlschemas.google.com/" xmlns:r="http://schemas.openxmlformats.org/officeDocument/2006/relationships" uri="GoogleDocsCustomDataVersion1">
   <go:docsCustomData xmlns:go="http://customooxmlschemas.google.com/" roundtripDataSignature="AMtx7mjxbXsydKqJJ1M4ufLnZ32xx0AF5A==">AMUW2mWOlc/P3dqpMZDmoBxrUF5njt0s09pMUR15gpS8Sybbjpv2bvauEw9TeuWIO7NEZQ+/Nttpb5lrIxqUGKFINCGY6Adflvfq2Cni1NdrzABk8YxKI472JzncClPQI57kjMfxjebl</go:docsCustomData>
 </go:gDocsCustomXmlDataStorage>
 </file>
 
-<file path=customXml/itemProps1.xml><?xml version="1.0" encoding="utf-8"?>
-<ds:datastoreItem xmlns:ds="http://schemas.openxmlformats.org/officeDocument/2006/customXml" ds:itemID="{40B390CA-3382-4C05-AF18-14AC77C1DE25}">
-  <ds:schemaRefs>
-    <ds:schemaRef ds:uri="http://schemas.openxmlformats.org/officeDocument/2006/bibliography"/>
-  </ds:schemaRefs>
-</ds:datastoreItem>
+<file path=customXml/item2.xml><?xml version="1.0" encoding="utf-8"?>
+<b:Sources xmlns:b="http://schemas.openxmlformats.org/officeDocument/2006/bibliography" xmlns="http://schemas.openxmlformats.org/officeDocument/2006/bibliography" SelectedStyle="\APASixthEditionOfficeOnline.xsl" StyleName="APA" Version="6"/>
 </file>
 
-<file path=customXml/itemProps2.xml><?xml version="1.0" encoding="utf-8"?>
+<file path=customXml/itemProps1.xml><?xml version="1.0" encoding="utf-8"?>
 <ds:datastoreItem xmlns:ds="http://schemas.openxmlformats.org/officeDocument/2006/customXml" ds:itemID="{11111111-1234-1234-1234-123412341234}">
   <ds:schemaRefs>
     <ds:schemaRef ds:uri="http://customooxmlschemas.google.com/"/>
     <ds:schemaRef ds:uri="http://schemas.openxmlformats.org/officeDocument/2006/relationships"/>
   </ds:schemaRefs>
 </ds:datastoreItem>
+</file>
+
+<file path=customXml/itemProps2.xml><?xml version="1.0" encoding="utf-8"?>
+<ds:datastoreItem xmlns:ds="http://schemas.openxmlformats.org/officeDocument/2006/customXml" ds:itemID="{40B390CA-3382-4C05-AF18-14AC77C1DE25}">
+  <ds:schemaRefs>
+    <ds:schemaRef ds:uri="http://schemas.openxmlformats.org/officeDocument/2006/bibliography"/>
+  </ds:schemaRefs>
+</ds:datastoreItem>
 </file>
</xml_diff>

<commit_message>
feat: ajustes de dados de miserabilidade
</commit_message>
<xml_diff>
--- a/template_final_real.docx
+++ b/template_final_real.docx
@@ -1710,7 +1710,15 @@
     </w:p>
     <w:p>
       <w:r>
-        <w:t>Destaca-se, o relato alhures é ratificado pela perícia social, realizada no processo administrativo que ensejou a presente demanda, onde a Assistente Social atesta o gral de miserabilidade da família (anexo 05, pgs. XX).</w:t>
+        <w:t xml:space="preserve">Destaca-se, o relato alhures é ratificado pela perícia social, realizada no processo administrativo que ensejou a presente demanda, onde a Assistente Social atesta o gral de miserabilidade da família (anexo 05, </w:t>
+      </w:r>
+      <w:proofErr w:type="spellStart"/>
+      <w:r>
+        <w:t>pgs</w:t>
+      </w:r>
+      <w:proofErr w:type="spellEnd"/>
+      <w:r>
+        <w:t>. XX).</w:t>
       </w:r>
     </w:p>
     <w:p>
@@ -1790,6 +1798,25 @@
       <w:r>
         <w:lastRenderedPageBreak/>
         <w:t>Portanto, imperioso seja concedido o benefício de prestação continuada à parte Autora, devido sua condição de pessoa deficiente, carecedora do devido amparo estatal.</w:t>
+      </w:r>
+    </w:p>
+    <w:p>
+      <w:pPr>
+        <w:pStyle w:val="Ttulo3"/>
+        <w:rPr>
+          <w:rFonts w:eastAsia="Times New Roman"/>
+        </w:rPr>
+      </w:pPr>
+      <w:r>
+        <w:rPr>
+          <w:rFonts w:eastAsia="Times New Roman"/>
+        </w:rPr>
+        <w:t>Dos fatores ambientais, atividades de participação e funções do corpo</w:t>
+      </w:r>
+    </w:p>
+    <w:p>
+      <w:r>
+        <w:t>[RESUMO DO RESULTADO]</w:t>
       </w:r>
     </w:p>
     <w:p>
@@ -1976,12 +2003,19 @@
         <w:rPr>
           <w:rFonts w:cstheme="minorHAnsi"/>
         </w:rPr>
-        <w:t xml:space="preserve">de natureza física, mental, intelectual ou sensorial, o qual, em interação com uma ou mais barreiras, pode obstruir sua participação plena e efetiva na sociedade em igualdade de condições com as demais pessoas, </w:t>
+        <w:t xml:space="preserve">de natureza física, mental, intelectual ou sensorial, o qual, em interação com uma ou mais barreiras, pode obstruir sua participação plena e </w:t>
       </w:r>
       <w:r>
         <w:rPr>
           <w:rFonts w:cstheme="minorHAnsi"/>
         </w:rPr>
+        <w:lastRenderedPageBreak/>
+        <w:t xml:space="preserve">efetiva na sociedade em igualdade de condições com as demais pessoas, </w:t>
+      </w:r>
+      <w:r>
+        <w:rPr>
+          <w:rFonts w:cstheme="minorHAnsi"/>
+        </w:rPr>
         <w:t>nos termos do</w:t>
       </w:r>
       <w:r>
@@ -2001,8 +2035,21 @@
         <w:rPr>
           <w:rFonts w:cstheme="minorHAnsi"/>
         </w:rPr>
-        <w:lastRenderedPageBreak/>
-        <w:t>Conforme nos ensina a jurista, mestre e Prof. Juliana de Oliveira Xavier Ribeiro (Direito Previdenciário Esquematizado, 2ª. Ed, 2011, Quartier Latin, p. 494/495):</w:t>
+        <w:t xml:space="preserve">Conforme nos ensina a jurista, mestre e Prof. Juliana de Oliveira Xavier Ribeiro (Direito Previdenciário Esquematizado, 2ª. Ed, 2011, Quartier </w:t>
+      </w:r>
+      <w:proofErr w:type="spellStart"/>
+      <w:r>
+        <w:rPr>
+          <w:rFonts w:cstheme="minorHAnsi"/>
+        </w:rPr>
+        <w:t>Latin</w:t>
+      </w:r>
+      <w:proofErr w:type="spellEnd"/>
+      <w:r>
+        <w:rPr>
+          <w:rFonts w:cstheme="minorHAnsi"/>
+        </w:rPr>
+        <w:t>, p. 494/495):</w:t>
       </w:r>
     </w:p>
     <w:p>
@@ -2306,14 +2353,8 @@
         <w:rPr>
           <w:rFonts w:cstheme="minorHAnsi"/>
         </w:rPr>
-        <w:t xml:space="preserve">Assim, a deficiência que dá acesso ao BPC-LOAS não é mais compreendida como aquela que incapacita a pessoa para a vida independente e para o trabalho, mas sim como um impedimento que, em interação com uma ou mais barreiras, </w:t>
-      </w:r>
-      <w:r>
-        <w:rPr>
-          <w:rFonts w:cstheme="minorHAnsi"/>
-        </w:rPr>
         <w:lastRenderedPageBreak/>
-        <w:t>possa restringir sua participação plena e efetiva na sociedade, em igualdade de condições com as demais pessoas.</w:t>
+        <w:t>Assim, a deficiência que dá acesso ao BPC-LOAS não é mais compreendida como aquela que incapacita a pessoa para a vida independente e para o trabalho, mas sim como um impedimento que, em interação com uma ou mais barreiras, possa restringir sua participação plena e efetiva na sociedade, em igualdade de condições com as demais pessoas.</w:t>
       </w:r>
     </w:p>
     <w:p>
@@ -2534,6 +2575,7 @@
         <w:ind w:left="1418" w:firstLine="0"/>
       </w:pPr>
       <w:r>
+        <w:lastRenderedPageBreak/>
         <w:t xml:space="preserve">e) </w:t>
       </w:r>
       <w:r>
@@ -2553,7 +2595,6 @@
         <w:ind w:left="1418" w:firstLine="0"/>
       </w:pPr>
       <w:r>
-        <w:lastRenderedPageBreak/>
         <w:t xml:space="preserve">f) </w:t>
       </w:r>
       <w:r>
@@ -2671,7 +2712,7 @@
           <w:b/>
           <w:bCs/>
         </w:rPr>
-        <w:t xml:space="preserve">Observa-se que em razão da gravidade das limitações apresentadas, bem como, dos cuidados demandados pela parte autora, fica demonstrado que as despesas que a família precisa custear para promover seu desenvolvimento são elevadas, dispendiosas e contínuas, de modo que, evidentemente, a renda familiar auferida não é suficiente para o pagamento dessas despesas, sem que comprometa o acesso a bens essenciais à sobrevivência digna da </w:t>
+        <w:t xml:space="preserve">Observa-se que em razão da gravidade das limitações apresentadas, bem como, dos cuidados demandados pela parte autora, fica demonstrado que as despesas que a família precisa custear </w:t>
       </w:r>
       <w:r>
         <w:rPr>
@@ -2679,7 +2720,7 @@
           <w:bCs/>
         </w:rPr>
         <w:lastRenderedPageBreak/>
-        <w:t>requerente e seus familiares.</w:t>
+        <w:t>para promover seu desenvolvimento são elevadas, dispendiosas e contínuas, de modo que, evidentemente, a renda familiar auferida não é suficiente para o pagamento dessas despesas, sem que comprometa o acesso a bens essenciais à sobrevivência digna da requerente e seus familiares.</w:t>
       </w:r>
       <w:r>
         <w:t xml:space="preserve"> 4. </w:t>
@@ -2688,7 +2729,15 @@
         <w:t>(...)</w:t>
       </w:r>
       <w:r>
-        <w:t xml:space="preserve"> (TRF-1 - AC: 00019217920174013315, Relator: DESEMBARGADOR FEDERAL RAFAEL PAULO, Data de Julgamento: 10/11/2021, 2ª Turma, Data de Publicação: PJe 19/11/2021 PAG)</w:t>
+        <w:t xml:space="preserve"> (TRF-1 - AC: 00019217920174013315, Relator: DESEMBARGADOR FEDERAL RAFAEL PAULO, Data de Julgamento: 10/11/2021, 2ª Turma, Data de Publicação: </w:t>
+      </w:r>
+      <w:proofErr w:type="spellStart"/>
+      <w:r>
+        <w:t>PJe</w:t>
+      </w:r>
+      <w:proofErr w:type="spellEnd"/>
+      <w:r>
+        <w:t xml:space="preserve"> 19/11/2021 PAG)</w:t>
       </w:r>
     </w:p>
     <w:p>
@@ -2806,7 +2855,14 @@
         <w:rPr>
           <w:b/>
         </w:rPr>
-        <w:t xml:space="preserve">às crianças e adolescentes menores de dezesseis anos de idade, deve ser avaliada a existência da deficiência e o seu impacto na limitação do desempenho de atividade e restrição da participação social, compatível com a idade. </w:t>
+        <w:t xml:space="preserve">às crianças e adolescentes menores de dezesseis anos de idade, deve ser avaliada a existência da deficiência e o seu </w:t>
+      </w:r>
+      <w:r>
+        <w:rPr>
+          <w:b/>
+        </w:rPr>
+        <w:lastRenderedPageBreak/>
+        <w:t xml:space="preserve">impacto na limitação do desempenho de atividade e restrição da participação social, compatível com a idade. </w:t>
       </w:r>
       <w:r>
         <w:t>(</w:t>
@@ -2868,7 +2924,6 @@
         <w:rPr>
           <w:rFonts w:cstheme="minorHAnsi"/>
         </w:rPr>
-        <w:lastRenderedPageBreak/>
         <w:t>As condições socioeconômicas e culturais d</w:t>
       </w:r>
       <w:r>
@@ -3064,11 +3119,8 @@
         <w:pStyle w:val="Citao"/>
       </w:pPr>
       <w:r>
-        <w:t xml:space="preserve">BENEFÍCIO ASSISTENCIAL. QUESTÃO DE FATO. O grupo familiar é composto por 5 pessoas e o total da renda atinge o montante de r$ 1.312,00 - absolutamente de acordo com o § 3º do artigo 20 da lei n. </w:t>
-      </w:r>
-      <w:r>
         <w:lastRenderedPageBreak/>
-        <w:t xml:space="preserve">8.742/1993. Além disso, está comprovado o requisito do § 2º daquele dispositivo, pois o autor tem quadro neuropsiquiátrico de transtorno hipercinético (TDAH - </w:t>
+        <w:t xml:space="preserve">BENEFÍCIO ASSISTENCIAL. QUESTÃO DE FATO. O grupo familiar é composto por 5 pessoas e o total da renda atinge o montante de r$ 1.312,00 - absolutamente de acordo com o § 3º do artigo 20 da lei n. 8.742/1993. Além disso, está comprovado o requisito do § 2º daquele dispositivo, pois o autor tem quadro neuropsiquiátrico de transtorno hipercinético (TDAH - </w:t>
       </w:r>
       <w:r>
         <w:t>CID</w:t>
@@ -3283,6 +3335,7 @@
         <w:pStyle w:val="Citao"/>
       </w:pPr>
       <w:r>
+        <w:lastRenderedPageBreak/>
         <w:t>Art. 15.  [...]</w:t>
       </w:r>
     </w:p>
@@ -3297,11 +3350,7 @@
         <w:t xml:space="preserve"> </w:t>
       </w:r>
       <w:r>
-        <w:t xml:space="preserve">não atende aos requisitos de concessão do benefício, o pedido </w:t>
-      </w:r>
-      <w:r>
-        <w:lastRenderedPageBreak/>
-        <w:t>deverá ser indeferido pelo INSS, sendo desnecessária a avaliação da deficiência.  </w:t>
+        <w:t>não atende aos requisitos de concessão do benefício, o pedido deverá ser indeferido pelo INSS, sendo desnecessária a avaliação da deficiência.  </w:t>
       </w:r>
     </w:p>
     <w:p>
@@ -3376,7 +3425,15 @@
         </w:rPr>
       </w:pPr>
       <w:r>
-        <w:t>(ii) Para os requerimentos administrativos anteriores a 07 de novembro de 2016 (Decreto n. 8.805/16), em que o indeferimento pelo INSS do Benefício da Prestação Continuada ocorrer em virtude de não constatação da deficiência, </w:t>
+        <w:t>(</w:t>
+      </w:r>
+      <w:proofErr w:type="spellStart"/>
+      <w:r>
+        <w:t>ii</w:t>
+      </w:r>
+      <w:proofErr w:type="spellEnd"/>
+      <w:r>
+        <w:t>) Para os requerimentos administrativos anteriores a 07 de novembro de 2016 (Decreto n. 8.805/16), em que o indeferimento pelo INSS do Benefício da Prestação Continuada ocorrer em virtude de não constatação da deficiência, </w:t>
       </w:r>
       <w:r>
         <w:rPr>
@@ -3510,7 +3567,21 @@
         <w:rPr>
           <w:i/>
         </w:rPr>
-        <w:t>in verbis:</w:t>
+        <w:t xml:space="preserve">in </w:t>
+      </w:r>
+      <w:proofErr w:type="spellStart"/>
+      <w:r>
+        <w:rPr>
+          <w:i/>
+        </w:rPr>
+        <w:t>verbis</w:t>
+      </w:r>
+      <w:proofErr w:type="spellEnd"/>
+      <w:r>
+        <w:rPr>
+          <w:i/>
+        </w:rPr>
+        <w:t>:</w:t>
       </w:r>
     </w:p>
     <w:p>
@@ -3651,7 +3722,15 @@
     </w:p>
     <w:p>
       <w:r>
-        <w:t>A parte autora pleiteia a concessão da justiça gratuita, por ser hipossuficiente e não possuir meios de arcar com as custas e despesas processuais sem prejuízo do próprio sustento e de sua família, nos termos do art. 5º, LXXIV, da CRFB/88 e dos arts. 98 e 99 do CPC/2015, conforme declaração de hipossuficiência anexa (doc. 01).</w:t>
+        <w:t xml:space="preserve">A parte autora pleiteia a concessão da justiça gratuita, por ser hipossuficiente e não possuir meios de arcar com as custas e despesas processuais sem prejuízo do próprio sustento e de sua família, nos termos do art. 5º, LXXIV, da CRFB/88 e dos </w:t>
+      </w:r>
+      <w:proofErr w:type="spellStart"/>
+      <w:r>
+        <w:t>arts</w:t>
+      </w:r>
+      <w:proofErr w:type="spellEnd"/>
+      <w:r>
+        <w:t>. 98 e 99 do CPC/2015, conforme declaração de hipossuficiência anexa (doc. 01).</w:t>
       </w:r>
     </w:p>
     <w:p>
@@ -4004,7 +4083,27 @@
           <w:bCs/>
           <w:i/>
         </w:rPr>
-        <w:t xml:space="preserve">inaudita altera pars, </w:t>
+        <w:t xml:space="preserve">inaudita altera </w:t>
+      </w:r>
+      <w:proofErr w:type="spellStart"/>
+      <w:r>
+        <w:rPr>
+          <w:rFonts w:cs="Arial"/>
+          <w:b/>
+          <w:bCs/>
+          <w:i/>
+        </w:rPr>
+        <w:t>pars</w:t>
+      </w:r>
+      <w:proofErr w:type="spellEnd"/>
+      <w:r>
+        <w:rPr>
+          <w:rFonts w:cs="Arial"/>
+          <w:b/>
+          <w:bCs/>
+          <w:i/>
+        </w:rPr>
+        <w:t xml:space="preserve">, </w:t>
       </w:r>
       <w:r>
         <w:rPr>
@@ -8783,28 +8882,28 @@
 </file>
 
 <file path=customXml/item1.xml><?xml version="1.0" encoding="utf-8"?>
+<b:Sources xmlns:b="http://schemas.openxmlformats.org/officeDocument/2006/bibliography" xmlns="http://schemas.openxmlformats.org/officeDocument/2006/bibliography" SelectedStyle="\APASixthEditionOfficeOnline.xsl" StyleName="APA" Version="6"/>
+</file>
+
+<file path=customXml/item2.xml><?xml version="1.0" encoding="utf-8"?>
 <go:gDocsCustomXmlDataStorage xmlns:go="http://customooxmlschemas.google.com/" xmlns:r="http://schemas.openxmlformats.org/officeDocument/2006/relationships" uri="GoogleDocsCustomDataVersion1">
   <go:docsCustomData xmlns:go="http://customooxmlschemas.google.com/" roundtripDataSignature="AMtx7mjxbXsydKqJJ1M4ufLnZ32xx0AF5A==">AMUW2mWOlc/P3dqpMZDmoBxrUF5njt0s09pMUR15gpS8Sybbjpv2bvauEw9TeuWIO7NEZQ+/Nttpb5lrIxqUGKFINCGY6Adflvfq2Cni1NdrzABk8YxKI472JzncClPQI57kjMfxjebl</go:docsCustomData>
 </go:gDocsCustomXmlDataStorage>
 </file>
 
-<file path=customXml/item2.xml><?xml version="1.0" encoding="utf-8"?>
-<b:Sources xmlns:b="http://schemas.openxmlformats.org/officeDocument/2006/bibliography" xmlns="http://schemas.openxmlformats.org/officeDocument/2006/bibliography" SelectedStyle="\APASixthEditionOfficeOnline.xsl" StyleName="APA" Version="6"/>
+<file path=customXml/itemProps1.xml><?xml version="1.0" encoding="utf-8"?>
+<ds:datastoreItem xmlns:ds="http://schemas.openxmlformats.org/officeDocument/2006/customXml" ds:itemID="{40B390CA-3382-4C05-AF18-14AC77C1DE25}">
+  <ds:schemaRefs>
+    <ds:schemaRef ds:uri="http://schemas.openxmlformats.org/officeDocument/2006/bibliography"/>
+  </ds:schemaRefs>
+</ds:datastoreItem>
 </file>
 
-<file path=customXml/itemProps1.xml><?xml version="1.0" encoding="utf-8"?>
+<file path=customXml/itemProps2.xml><?xml version="1.0" encoding="utf-8"?>
 <ds:datastoreItem xmlns:ds="http://schemas.openxmlformats.org/officeDocument/2006/customXml" ds:itemID="{11111111-1234-1234-1234-123412341234}">
   <ds:schemaRefs>
     <ds:schemaRef ds:uri="http://customooxmlschemas.google.com/"/>
     <ds:schemaRef ds:uri="http://schemas.openxmlformats.org/officeDocument/2006/relationships"/>
   </ds:schemaRefs>
 </ds:datastoreItem>
-</file>
-
-<file path=customXml/itemProps2.xml><?xml version="1.0" encoding="utf-8"?>
-<ds:datastoreItem xmlns:ds="http://schemas.openxmlformats.org/officeDocument/2006/customXml" ds:itemID="{40B390CA-3382-4C05-AF18-14AC77C1DE25}">
-  <ds:schemaRefs>
-    <ds:schemaRef ds:uri="http://schemas.openxmlformats.org/officeDocument/2006/bibliography"/>
-  </ds:schemaRefs>
-</ds:datastoreItem>
 </file>
</xml_diff>